<commit_message>
Add link to curriculum.
</commit_message>
<xml_diff>
--- a/documents/state-documents/Standards-for-New-Academic-Degree-Programs-Form.docx
+++ b/documents/state-documents/Standards-for-New-Academic-Degree-Programs-Form.docx
@@ -4582,7 +4582,22 @@
                 <w:szCs w:val="22"/>
                 <w:lang w:val="en-US" w:eastAsia="en-US" w:bidi="ar-SA"/>
               </w:rPr>
-              <w:t>See Supplemental Documents and addenda.</w:t>
+              <w:t>See Supplemental Documents and addend</w:t>
+            </w:r>
+            <w:r>
+              <w:rPr>
+                <w:rStyle w:val="PlaceholderText"/>
+                <w:rFonts w:eastAsia="Calibri" w:cs="Calibri"/>
+                <w:b/>
+                <w:bCs/>
+                <w:i/>
+                <w:iCs/>
+                <w:kern w:val="0"/>
+                <w:sz w:val="22"/>
+                <w:szCs w:val="22"/>
+                <w:lang w:val="en-US" w:eastAsia="en-US" w:bidi="ar-SA"/>
+              </w:rPr>
+              <w:t>a.</w:t>
             </w:r>
           </w:p>
           <w:p>
@@ -13378,6 +13393,25 @@
         <w:spacing w:lineRule="auto" w:line="240" w:before="0" w:after="0"/>
         <w:ind w:start="257"/>
         <w:jc w:val="both"/>
+        <w:rPr/>
+      </w:pPr>
+      <w:r>
+        <w:rPr>
+          <w:rStyle w:val="PlaceholderText"/>
+          <w:b/>
+          <w:bCs/>
+          <w:sz w:val="30"/>
+          <w:szCs w:val="30"/>
+        </w:rPr>
+        <w:t>GRID Curriculum Repository:</w:t>
+      </w:r>
+    </w:p>
+    <w:p>
+      <w:pPr>
+        <w:pStyle w:val="Normal"/>
+        <w:spacing w:lineRule="auto" w:line="240" w:before="0" w:after="0"/>
+        <w:ind w:start="257"/>
+        <w:jc w:val="both"/>
         <w:rPr>
           <w:rFonts w:ascii="Calibri" w:hAnsi="Calibri" w:eastAsia="Times New Roman" w:cs="Calibri"/>
         </w:rPr>
@@ -13386,7 +13420,31 @@
         <w:rPr>
           <w:rStyle w:val="PlaceholderText"/>
         </w:rPr>
-        <w:t>Click or tap here to enter text.</w:t>
+        <w:tab/>
+      </w:r>
+      <w:r>
+        <w:rPr>
+          <w:rStyle w:val="PlaceholderText"/>
+        </w:rPr>
+        <w:t xml:space="preserve"> </w:t>
+      </w:r>
+      <w:hyperlink r:id="rId7">
+        <w:r>
+          <w:rPr>
+            <w:rStyle w:val="Hyperlink"/>
+            <w:sz w:val="22"/>
+            <w:szCs w:val="22"/>
+          </w:rPr>
+          <w:t>https://github.com/SteveCaruso/grid/tree/main</w:t>
+        </w:r>
+      </w:hyperlink>
+      <w:r>
+        <w:rPr>
+          <w:rStyle w:val="PlaceholderText"/>
+          <w:sz w:val="22"/>
+          <w:szCs w:val="22"/>
+        </w:rPr>
+        <w:t xml:space="preserve"> </w:t>
       </w:r>
     </w:p>
     <w:p>
@@ -13394,16 +13452,25 @@
         <w:pStyle w:val="Normal"/>
         <w:rPr>
           <w:rFonts w:ascii="Calibri" w:hAnsi="Calibri" w:eastAsia="Times New Roman" w:cs="Calibri"/>
-          <w:sz w:val="24"/>
-          <w:szCs w:val="24"/>
+          <w:sz w:val="22"/>
+          <w:szCs w:val="22"/>
         </w:rPr>
       </w:pPr>
       <w:r>
         <w:rPr>
           <w:rFonts w:eastAsia="Times New Roman" w:cs="Calibri"/>
-          <w:sz w:val="24"/>
-          <w:szCs w:val="24"/>
+          <w:sz w:val="22"/>
+          <w:szCs w:val="22"/>
         </w:rPr>
+        <w:tab/>
+      </w:r>
+      <w:r>
+        <w:rPr>
+          <w:rFonts w:eastAsia="Times New Roman" w:cs="Calibri"/>
+          <w:sz w:val="22"/>
+          <w:szCs w:val="22"/>
+        </w:rPr>
+        <w:t>This repository contains the entire GRID Curriculum, Course Outlines, and other data.</w:t>
       </w:r>
     </w:p>
     <w:p>
@@ -13500,7 +13567,7 @@
           <w:color w:val="000000"/>
         </w:rPr>
       </w:pPr>
-      <w:hyperlink r:id="rId7">
+      <w:hyperlink r:id="rId8">
         <w:r>
           <w:rPr>
             <w:rStyle w:val="Style3"/>
@@ -13545,7 +13612,7 @@
         </w:rPr>
         <w:t xml:space="preserve">New Jersey State Plan for Higher Education: Where Opportunity Meets Innovation: </w:t>
       </w:r>
-      <w:hyperlink r:id="rId8">
+      <w:hyperlink r:id="rId9">
         <w:r>
           <w:rPr>
             <w:rStyle w:val="Style3"/>
@@ -13600,7 +13667,7 @@
           <w:color w:val="000000"/>
         </w:rPr>
       </w:pPr>
-      <w:hyperlink r:id="rId9">
+      <w:hyperlink r:id="rId10">
         <w:r>
           <w:rPr>
             <w:rStyle w:val="Style3"/>
@@ -13692,7 +13759,7 @@
         </w:rPr>
         <w:t xml:space="preserve"> </w:t>
       </w:r>
-      <w:hyperlink r:id="rId10">
+      <w:hyperlink r:id="rId11">
         <w:r>
           <w:rPr>
             <w:rStyle w:val="Style3"/>
@@ -13733,7 +13800,7 @@
           <w:u w:val="single"/>
         </w:rPr>
       </w:pPr>
-      <w:hyperlink r:id="rId11">
+      <w:hyperlink r:id="rId12">
         <w:r>
           <w:rPr>
             <w:rStyle w:val="Hyperlink"/>
@@ -13787,7 +13854,7 @@
           <w:color w:val="000000"/>
         </w:rPr>
       </w:pPr>
-      <w:hyperlink r:id="rId12">
+      <w:hyperlink r:id="rId13">
         <w:r>
           <w:rPr>
             <w:rStyle w:val="Style3"/>
@@ -13842,7 +13909,7 @@
           <w:color w:val="000000"/>
         </w:rPr>
       </w:pPr>
-      <w:hyperlink r:id="rId13">
+      <w:hyperlink r:id="rId14">
         <w:r>
           <w:rPr>
             <w:rStyle w:val="Style3"/>
@@ -13864,7 +13931,7 @@
           <w:color w:val="000000"/>
         </w:rPr>
       </w:pPr>
-      <w:hyperlink r:id="rId14">
+      <w:hyperlink r:id="rId15">
         <w:r>
           <w:rPr>
             <w:rStyle w:val="Style3"/>
@@ -13919,7 +13986,7 @@
           <w:color w:val="000000"/>
         </w:rPr>
       </w:pPr>
-      <w:hyperlink r:id="rId15">
+      <w:hyperlink r:id="rId16">
         <w:r>
           <w:rPr>
             <w:rStyle w:val="Style3"/>
@@ -14027,12 +14094,12 @@
       </w:r>
     </w:p>
     <w:sectPr>
-      <w:headerReference w:type="even" r:id="rId16"/>
-      <w:headerReference w:type="default" r:id="rId17"/>
-      <w:headerReference w:type="first" r:id="rId18"/>
-      <w:footerReference w:type="even" r:id="rId19"/>
-      <w:footerReference w:type="default" r:id="rId20"/>
-      <w:footerReference w:type="first" r:id="rId21"/>
+      <w:headerReference w:type="even" r:id="rId17"/>
+      <w:headerReference w:type="default" r:id="rId18"/>
+      <w:headerReference w:type="first" r:id="rId19"/>
+      <w:footerReference w:type="even" r:id="rId20"/>
+      <w:footerReference w:type="default" r:id="rId21"/>
+      <w:footerReference w:type="first" r:id="rId22"/>
       <w:type w:val="nextPage"/>
       <w:pgSz w:w="12240" w:h="15840"/>
       <w:pgMar w:left="1440" w:right="1440" w:gutter="0" w:header="720" w:top="1440" w:footer="720" w:bottom="1440"/>
@@ -14124,7 +14191,7 @@
         <w:sz w:val="16"/>
         <w:szCs w:val="16"/>
       </w:rPr>
-      <w:t>12</w:t>
+      <w:t>14</w:t>
     </w:r>
     <w:r>
       <w:rPr>
@@ -14278,7 +14345,7 @@
         <w:sz w:val="16"/>
         <w:szCs w:val="16"/>
       </w:rPr>
-      <w:t>12</w:t>
+      <w:t>14</w:t>
     </w:r>
     <w:r>
       <w:rPr>

</xml_diff>